<commit_message>
video link in txt file and in the Rapport_e-joutia.docx file
</commit_message>
<xml_diff>
--- a/rapport_e-joutia.docx
+++ b/rapport_e-joutia.docx
@@ -433,7 +433,6 @@
         <w:spacing w:after="200"/>
         <w:rPr>
           <w:rFonts w:asciiTheme="majorBidi" w:hAnsiTheme="majorBidi" w:cstheme="majorBidi"/>
-          <w:lang w:val="en-US"/>
         </w:rPr>
       </w:pPr>
       <w:r>
@@ -453,7 +452,6 @@
           <w:bCs/>
           <w:sz w:val="28"/>
           <w:szCs w:val="28"/>
-          <w:lang w:val="en-US"/>
         </w:rPr>
         <w:t xml:space="preserve">GitHub </w:t>
       </w:r>
@@ -464,21 +462,16 @@
           <w:bCs/>
           <w:sz w:val="28"/>
           <w:szCs w:val="28"/>
-          <w:lang w:val="en-US"/>
         </w:rPr>
         <w:t>Link</w:t>
       </w:r>
       <w:r>
         <w:rPr>
           <w:rFonts w:asciiTheme="majorBidi" w:hAnsiTheme="majorBidi" w:cstheme="majorBidi"/>
-          <w:lang w:val="en-US"/>
-        </w:rPr>
-        <w:t>:</w:t>
-      </w:r>
-      <w:r>
-        <w:rPr>
-          <w:lang w:val="en-US"/>
-        </w:rPr>
+        </w:rPr>
+        <w:t xml:space="preserve"> :</w:t>
+      </w:r>
+      <w:r>
         <w:t xml:space="preserve"> </w:t>
       </w:r>
       <w:hyperlink r:id="rId8" w:history="1">
@@ -486,22 +479,17 @@
           <w:rPr>
             <w:rStyle w:val="Hyperlink"/>
             <w:rFonts w:asciiTheme="majorBidi" w:hAnsiTheme="majorBidi" w:cstheme="majorBidi"/>
-            <w:lang w:val="en-US"/>
           </w:rPr>
           <w:t>https://github.com/chahidzaid-ai/E-joutia-</w:t>
         </w:r>
         <w:r>
           <w:rPr>
             <w:rStyle w:val="Hyperlink"/>
-            <w:lang w:val="en-US"/>
           </w:rPr>
           <w:t xml:space="preserve"> </w:t>
         </w:r>
       </w:hyperlink>
       <w:r>
-        <w:rPr>
-          <w:lang w:val="en-US"/>
-        </w:rPr>
         <w:t xml:space="preserve"> </w:t>
       </w:r>
     </w:p>
@@ -510,7 +498,6 @@
         <w:spacing w:after="200"/>
         <w:rPr>
           <w:rFonts w:asciiTheme="majorBidi" w:hAnsiTheme="majorBidi" w:cstheme="majorBidi"/>
-          <w:lang w:val="en-US"/>
         </w:rPr>
       </w:pPr>
     </w:p>
@@ -519,7 +506,6 @@
         <w:spacing w:after="200"/>
         <w:rPr>
           <w:rFonts w:asciiTheme="majorBidi" w:hAnsiTheme="majorBidi" w:cstheme="majorBidi"/>
-          <w:lang w:val="en-US"/>
         </w:rPr>
       </w:pPr>
     </w:p>
@@ -1071,6 +1057,7 @@
       <w:r>
         <w:rPr>
           <w:rFonts w:asciiTheme="majorBidi" w:hAnsiTheme="majorBidi" w:cstheme="majorBidi"/>
+          <w:noProof/>
         </w:rPr>
         <w:drawing>
           <wp:inline distT="0" distB="0" distL="0" distR="0" wp14:anchorId="5AD09FD8" wp14:editId="10911144">
@@ -7070,7 +7057,7 @@
           <w:szCs w:val="24"/>
         </w:rPr>
         <w:drawing>
-          <wp:inline distT="0" distB="0" distL="0" distR="0" wp14:anchorId="6E391825" wp14:editId="7F0D7BF1">
+          <wp:inline distT="0" distB="0" distL="0" distR="0" wp14:anchorId="6E391825" wp14:editId="38F30349">
             <wp:extent cx="2574925" cy="5054600"/>
             <wp:effectExtent l="0" t="0" r="0" b="0"/>
             <wp:docPr id="939482530" name="Picture 4"/>
@@ -7128,7 +7115,7 @@
           <w:szCs w:val="24"/>
         </w:rPr>
         <w:drawing>
-          <wp:inline distT="0" distB="0" distL="0" distR="0" wp14:anchorId="2AA5940A" wp14:editId="2AD3165B">
+          <wp:inline distT="0" distB="0" distL="0" distR="0" wp14:anchorId="2AA5940A" wp14:editId="4FE5AB8C">
             <wp:extent cx="2675890" cy="5056433"/>
             <wp:effectExtent l="0" t="0" r="0" b="0"/>
             <wp:docPr id="1440194617" name="Picture 5"/>
@@ -7273,7 +7260,7 @@
           <w:szCs w:val="24"/>
         </w:rPr>
         <w:drawing>
-          <wp:inline distT="0" distB="0" distL="0" distR="0" wp14:anchorId="30C8DDAB" wp14:editId="09CCA78F">
+          <wp:inline distT="0" distB="0" distL="0" distR="0" wp14:anchorId="30C8DDAB" wp14:editId="4A8E4B25">
             <wp:extent cx="2781718" cy="6150635"/>
             <wp:effectExtent l="0" t="0" r="0" b="2540"/>
             <wp:docPr id="795924247" name="Picture 6"/>
@@ -7342,6 +7329,7 @@
       <w:r>
         <w:rPr>
           <w:rFonts w:asciiTheme="majorBidi" w:hAnsiTheme="majorBidi" w:cstheme="majorBidi"/>
+          <w:noProof/>
           <w:sz w:val="24"/>
           <w:szCs w:val="24"/>
         </w:rPr>

</xml_diff>